<commit_message>
kpmg/zpp_forecast_paints: ZPP_FORECAST_PAINTS_UPL now carries all nine upload types (Adhesive upload copied + Brand + 4-value indicator); ZIP rebuilt; handover docs updated; generator and checker scripts kept
M	kpmg/zpp_forecast_paints/00_TECHNICAL_OBJECTS.md
M	kpmg/zpp_forecast_paints/ISSUES.md
M	kpmg/zpp_forecast_paints/KT_TCODES.md
M	kpmg/zpp_forecast_paints/NOTES.md
M	kpmg/zpp_forecast_paints/ZPP_FORECAST_PAINTS.zip
M	kpmg/zpp_forecast_paints/docs/TS_ZFORECAST_Paints.docx
M	kpmg/zpp_forecast_paints/docs/TS_ZFORECAST_Paints.md
M	kpmg/zpp_forecast_paints/docs/ZFORECAST_Paints_KT_Tcodes.docx
M	kpmg/zpp_forecast_paints/docs/ZFORECAST_Paints_Test_Handover.docx
M	kpmg/zpp_forecast_paints/docs/ZFORECAST_Paints_Test_Handover.md
M	kpmg/zpp_forecast_paints/src/zpp_forecast_paints_upl.prog.abap
M	kpmg/zpp_forecast_paints/src/zpp_forecast_paints_upl.prog.xml
A	kpmg/zpp_forecast_paints/tools/abapcheck.py
A	kpmg/zpp_forecast_paints/tools/mkupl.py

Co-Authored-By: Claude <noreply@anthropic.com>
</commit_message>
<xml_diff>
--- a/kpmg/zpp_forecast_paints/docs/TS_ZFORECAST_Paints.docx
+++ b/kpmg/zpp_forecast_paints/docs/TS_ZFORECAST_Paints.docx
@@ -2793,7 +2793,7 @@
       </w:r>
     </w:p>
     <w:bookmarkEnd w:id="24"/>
-    <w:bookmarkStart w:id="25" w:name="X6156b7cd96e9ac18cc2547da399f91948439533"/>
+    <w:bookmarkStart w:id="25" w:name="X2430ac70c688013bc39d7ec6cb8de7b1b7b8ea4"/>
     <w:p>
       <w:pPr>
         <w:pStyle w:val="Heading3"/>
@@ -2814,7 +2814,7 @@
         <w:t xml:space="preserve"> </w:t>
       </w:r>
       <w:r>
-        <w:t xml:space="preserve">— category and brand uploads</w:t>
+        <w:t xml:space="preserve">— all nine Paints uploads</w:t>
       </w:r>
     </w:p>
     <w:p>
@@ -2822,13 +2822,22 @@
         <w:pStyle w:val="FirstParagraph"/>
       </w:pPr>
       <w:r>
-        <w:t xml:space="preserve">Two radio buttons, each with its own Download Template button, plus file, header-row and</w:t>
-      </w:r>
-      <w:r>
-        <w:t xml:space="preserve"> </w:t>
-      </w:r>
-      <w:r>
-        <w:t xml:space="preserve">test-run fields; file handling (Excel through</w:t>
+        <w:rPr>
+          <w:rStyle w:val="VerbatimChar"/>
+        </w:rPr>
+        <w:t xml:space="preserve">ZPP_FORECAST_UPLOAD</w:t>
+      </w:r>
+      <w:r>
+        <w:t xml:space="preserve"> </w:t>
+      </w:r>
+      <w:r>
+        <w:t xml:space="preserve">copied whole (repo copy activated 23/09/26: eight radio buttons, each</w:t>
+      </w:r>
+      <w:r>
+        <w:t xml:space="preserve"> </w:t>
+      </w:r>
+      <w:r>
+        <w:t xml:space="preserve">with its own Download Template button, Excel through</w:t>
       </w:r>
       <w:r>
         <w:t xml:space="preserve"> </w:t>
@@ -2840,25 +2849,70 @@
         <w:t xml:space="preserve">CL_FDT_XL_SPREADSHEET</w:t>
       </w:r>
       <w:r>
-        <w:t xml:space="preserve">, CSV, tab text, header</w:t>
-      </w:r>
-      <w:r>
-        <w:t xml:space="preserve"> </w:t>
-      </w:r>
-      <w:r>
-        <w:t xml:space="preserve">detection, per-row result list with traffic light, commit of good rows only) copied from</w:t>
-      </w:r>
-      <w:r>
-        <w:t xml:space="preserve"> </w:t>
-      </w:r>
-      <w:r>
-        <w:rPr>
-          <w:rStyle w:val="VerbatimChar"/>
-        </w:rPr>
-        <w:t xml:space="preserve">ZPP_FORECAST_UPLOAD</w:t>
-      </w:r>
-      <w:r>
-        <w:t xml:space="preserve">.</w:t>
+        <w:t xml:space="preserve">, CSV, tab text,</w:t>
+      </w:r>
+      <w:r>
+        <w:t xml:space="preserve"> </w:t>
+      </w:r>
+      <w:r>
+        <w:t xml:space="preserve">header detection, per-row result list with traffic light, commit of good rows only) with</w:t>
+      </w:r>
+      <w:r>
+        <w:t xml:space="preserve"> </w:t>
+      </w:r>
+      <w:r>
+        <w:t xml:space="preserve">three additions: a ninth radio button Brand,</w:t>
+      </w:r>
+      <w:r>
+        <w:t xml:space="preserve"> </w:t>
+      </w:r>
+      <w:r>
+        <w:rPr>
+          <w:rStyle w:val="VerbatimChar"/>
+        </w:rPr>
+        <w:t xml:space="preserve">FORM DO_BRAND</w:t>
+      </w:r>
+      <w:r>
+        <w:t xml:space="preserve">, and</w:t>
+      </w:r>
+      <w:r>
+        <w:t xml:space="preserve"> </w:t>
+      </w:r>
+      <w:r>
+        <w:rPr>
+          <w:rStyle w:val="VerbatimChar"/>
+        </w:rPr>
+        <w:t xml:space="preserve">FORM CHECK_INDICATOR</w:t>
+      </w:r>
+      <w:r>
+        <w:t xml:space="preserve"> </w:t>
+      </w:r>
+      <w:r>
+        <w:t xml:space="preserve">replacing the MTS/MTO-only check in</w:t>
+      </w:r>
+      <w:r>
+        <w:t xml:space="preserve"> </w:t>
+      </w:r>
+      <w:r>
+        <w:rPr>
+          <w:rStyle w:val="VerbatimChar"/>
+        </w:rPr>
+        <w:t xml:space="preserve">FORM DO_CATEGORY</w:t>
+      </w:r>
+      <w:r>
+        <w:t xml:space="preserve">. Tracking, exclusion, legacy history,</w:t>
+      </w:r>
+      <w:r>
+        <w:t xml:space="preserve"> </w:t>
+      </w:r>
+      <w:r>
+        <w:t xml:space="preserve">business forecast and forecast change are the Adhesive routines unchanged and write the same</w:t>
+      </w:r>
+      <w:r>
+        <w:t xml:space="preserve"> </w:t>
+      </w:r>
+      <w:r>
+        <w:t xml:space="preserve">tables. A Paints user never needs ZFCST_UPL.</w:t>
       </w:r>
     </w:p>
     <w:tbl>

</xml_diff>

<commit_message>
kpmg/zpp_forecast_paints: status + tcode done, TR DEVK930479; functional test pack (Paints only)
M	kpmg/zpp_forecast_paints/00_TECHNICAL_OBJECTS.md
M	kpmg/zpp_forecast_paints/ISSUES.md
M	kpmg/zpp_forecast_paints/NOTES.md
M	kpmg/zpp_forecast_paints/docs/TS_ZFORECAST_Paints.docx
M	kpmg/zpp_forecast_paints/docs/TS_ZFORECAST_Paints.md
M	kpmg/zpp_forecast_paints/docs/ZFORECAST_Paints_Test_Handover.docx
M	kpmg/zpp_forecast_paints/docs/ZFORECAST_Paints_Test_Handover.md

Co-Authored-By: Claude <noreply@anthropic.com>
</commit_message>
<xml_diff>
--- a/kpmg/zpp_forecast_paints/docs/TS_ZFORECAST_Paints.docx
+++ b/kpmg/zpp_forecast_paints/docs/TS_ZFORECAST_Paints.docx
@@ -491,7 +491,11 @@
           <w:p>
             <w:pPr>
               <w:pStyle w:val="Compact"/>
-            </w:pPr>
+              <w:jc w:val="left"/>
+            </w:pPr>
+            <w:r>
+              <w:t xml:space="preserve">DEVK930479</w:t>
+            </w:r>
           </w:p>
         </w:tc>
       </w:tr>

</xml_diff>